<commit_message>
Related Work: verified references [5] (Google Play policy) and [9] (Frontiers 2026)
</commit_message>
<xml_diff>
--- a/report/related_work.docx
+++ b/report/related_work.docx
@@ -22,7 +22,7 @@
       </w:r>
       <w:r>
         <w:rPr/>
-        <w:t xml:space="preserve"> Unauthorised lending apps became a visible problem in India from 2020, with reports of usurious charges, data harvesting and harassment of borrowers' contacts. An RBI Working Group on digital lending estimated that about 600 of roughly 1,100 lending apps available to Indian users were illegal [1]. Practitioner surveys document how such apps reach users and the harm they cause [2], and a 2024 review describes them as a form of cyber-psychological manipulation [3]. Regulation has since tightened: the Reserve Bank of India (Digital Lending) Directions, 2025 require regulated entities to report every digital lending app they deploy, and since July 2025 RBI publishes the resulting directory [4]. Google Play's policy for India then required personal-loan apps to be published by, or in partnership with, regulated entities, and unlisted apps were to be removed from January 2026 [5]. Enforcement continues: India's Cybercrime Coordination Centre ordered the removal of further loan apps in 2026 [6].</w:t>
+        <w:t xml:space="preserve"> Unauthorised lending apps became a visible problem in India from 2020, with reports of usurious charges, data harvesting and harassment of borrowers' contacts. An RBI Working Group on digital lending estimated that about 600 of roughly 1,100 lending apps available to Indian users were illegal [1]. Practitioner surveys document how such apps reach users and the harm they cause [2], and a 2024 review describes them as a form of cyber-psychological manipulation [3]. Regulation has since tightened: the Reserve Bank of India (Digital Lending) Directions, 2025 require regulated entities to report every digital lending app they deploy, and since July 2025 RBI publishes the resulting directory [4]. Google Play then required every personal-loan app in India to appear in that directory: new apps from 30 October 2025, and existing apps by 28 January 2026 [5]. Enforcement continues: India's Cybercrime Coordination Centre ordered the removal of further loan apps in 2026 [6].</w:t>
       </w:r>
     </w:p>
     <w:p>
@@ -37,7 +37,7 @@
       </w:r>
       <w:r>
         <w:rPr/>
-        <w:t xml:space="preserve"> Fu and Mishra used Play Store metadata and user reviews from India, Nigeria and the Philippines to flag predatory fintech apps with machine learning [7]. The closest recent work, by Akanji, Egele and Stringhini, measures 434 loan apps from Indonesia, Kenya, Nigeria, Pakistan and the Philippines against national regulation and Google's Financial Services policy. It uses static and dynamic code analysis, with LLM-assisted mapping from policy text to permissions, and finds violations in about a third of the apps; Google removed 93 apps after disclosure [8]. India is not part of that sample. For India, Sekhar and Saheb analyse 15,408 reviews of seven RBI-approved lending platforms with topic modelling and supervised classifiers [9], which characterises sentiment toward approved lenders rather than separating approved apps from unapproved ones.</w:t>
+        <w:t xml:space="preserve"> Fu and Mishra used Play Store metadata and user reviews from India, Nigeria and the Philippines to flag predatory fintech apps with machine learning [7]. The closest recent work, by Akanji, Egele and Stringhini, measures 434 loan apps from Indonesia, Kenya, Nigeria, Pakistan and the Philippines against national regulation and Google's Financial Services policy. It uses static and dynamic code analysis, with LLM-assisted mapping from policy text to permissions, and finds violations in about a third of the apps; Google removed 93 apps after disclosure [8]. India is not part of that sample. For India, Sekhar and Saheb analyse 15,408 reviews of seven RBI-approved peer-to-peer lending platforms with topic modelling and supervised classifiers [9], which characterises sentiment toward approved lenders rather than separating approved apps from unapproved ones.</w:t>
       </w:r>
     </w:p>
     <w:p>
@@ -122,13 +122,7 @@
       </w:pPr>
       <w:r>
         <w:rPr/>
-        <w:t xml:space="preserve">[5] Google Play Developer Policy Center: Financial Services policy, personal loan apps in India (requirement for listing in RBI's DLA directory; deadline 28 January 2026). </w:t>
-      </w:r>
-      <w:r>
-        <w:rPr>
-          <w:i/>
-        </w:rPr>
-        <w:t>Verify the exact wording and date against Google's policy page before citing.</w:t>
+        <w:t>[5] Google: Play Console Help, Personal loan app requirements for India: apps must be on RBI's list "DLAs Deployed by Regulated Entities"; new apps from 30 October 2025, existing apps by 28 January 2026. https://support.google.com/googleplay/android-developer/answer/16604194</w:t>
       </w:r>
     </w:p>
     <w:p>
@@ -164,7 +158,7 @@
       </w:pPr>
       <w:r>
         <w:rPr/>
-        <w:t>[9] Sekhar, Saheb: [title as published]. Frontiers in Artificial Intelligence (2026). doi:10.3389/frai.2025.1708080</w:t>
+        <w:t>[9] Sekhar, K.R., Saheb, S.S.: User perceptions of RBI-approved P2P digital lending apps: an NLP, machine learning, and deep learning approach. Frontiers in Artificial Intelligence 8 (2025), published 12 January 2026. doi:10.3389/frai.2025.1708080</w:t>
       </w:r>
     </w:p>
     <w:p>

</xml_diff>